<commit_message>
validation is done in text.docx
</commit_message>
<xml_diff>
--- a/a2/Text.docx
+++ b/a2/Text.docx
@@ -9,11 +9,14 @@
     </w:p>
     <w:p>
       <w:r>
+        <w:rPr>
+          <w:noProof/>
+        </w:rPr>
         <w:drawing>
-          <wp:inline distT="0" distB="0" distL="0" distR="0" wp14:anchorId="2FA9E31C" wp14:editId="18004475">
-            <wp:extent cx="5731510" cy="2094230"/>
-            <wp:effectExtent l="0" t="0" r="2540" b="1270"/>
-            <wp:docPr id="765003101" name="Picture 1" descr="A screenshot of a computer&#10;&#10;Description automatically generated"/>
+          <wp:inline distT="0" distB="0" distL="0" distR="0" wp14:anchorId="03FF239B" wp14:editId="23492554">
+            <wp:extent cx="5731510" cy="3223895"/>
+            <wp:effectExtent l="0" t="0" r="2540" b="0"/>
+            <wp:docPr id="109209919" name="Picture 1" descr="A screenshot of a computer&#10;&#10;Description automatically generated"/>
             <wp:cNvGraphicFramePr>
               <a:graphicFrameLocks xmlns:a="http://schemas.openxmlformats.org/drawingml/2006/main" noChangeAspect="1"/>
             </wp:cNvGraphicFramePr>
@@ -21,7 +24,7 @@
               <a:graphicData uri="http://schemas.openxmlformats.org/drawingml/2006/picture">
                 <pic:pic xmlns:pic="http://schemas.openxmlformats.org/drawingml/2006/picture">
                   <pic:nvPicPr>
-                    <pic:cNvPr id="765003101" name="Picture 1" descr="A screenshot of a computer&#10;&#10;Description automatically generated"/>
+                    <pic:cNvPr id="109209919" name="Picture 1" descr="A screenshot of a computer&#10;&#10;Description automatically generated"/>
                     <pic:cNvPicPr/>
                   </pic:nvPicPr>
                   <pic:blipFill>
@@ -33,7 +36,7 @@
                   <pic:spPr>
                     <a:xfrm>
                       <a:off x="0" y="0"/>
-                      <a:ext cx="5731510" cy="2094230"/>
+                      <a:ext cx="5731510" cy="3223895"/>
                     </a:xfrm>
                     <a:prstGeom prst="rect">
                       <a:avLst/>
@@ -60,11 +63,14 @@
     </w:p>
     <w:p>
       <w:r>
+        <w:rPr>
+          <w:noProof/>
+        </w:rPr>
         <w:drawing>
-          <wp:inline distT="0" distB="0" distL="0" distR="0" wp14:anchorId="6452D2F2" wp14:editId="3A945F40">
-            <wp:extent cx="5731510" cy="1588135"/>
+          <wp:inline distT="0" distB="0" distL="0" distR="0" wp14:anchorId="78895DDB" wp14:editId="72E3DBD4">
+            <wp:extent cx="5731510" cy="3223895"/>
             <wp:effectExtent l="0" t="0" r="2540" b="0"/>
-            <wp:docPr id="1482117860" name="Picture 1" descr="A screenshot of a computer&#10;&#10;Description automatically generated"/>
+            <wp:docPr id="320588733" name="Picture 1" descr="A screenshot of a computer&#10;&#10;Description automatically generated"/>
             <wp:cNvGraphicFramePr>
               <a:graphicFrameLocks xmlns:a="http://schemas.openxmlformats.org/drawingml/2006/main" noChangeAspect="1"/>
             </wp:cNvGraphicFramePr>
@@ -72,7 +78,7 @@
               <a:graphicData uri="http://schemas.openxmlformats.org/drawingml/2006/picture">
                 <pic:pic xmlns:pic="http://schemas.openxmlformats.org/drawingml/2006/picture">
                   <pic:nvPicPr>
-                    <pic:cNvPr id="1482117860" name="Picture 1" descr="A screenshot of a computer&#10;&#10;Description automatically generated"/>
+                    <pic:cNvPr id="320588733" name="Picture 1" descr="A screenshot of a computer&#10;&#10;Description automatically generated"/>
                     <pic:cNvPicPr/>
                   </pic:nvPicPr>
                   <pic:blipFill>
@@ -84,7 +90,7 @@
                   <pic:spPr>
                     <a:xfrm>
                       <a:off x="0" y="0"/>
-                      <a:ext cx="5731510" cy="1588135"/>
+                      <a:ext cx="5731510" cy="3223895"/>
                     </a:xfrm>
                     <a:prstGeom prst="rect">
                       <a:avLst/>
@@ -104,11 +110,15 @@
     </w:p>
     <w:p>
       <w:r>
+        <w:rPr>
+          <w:noProof/>
+        </w:rPr>
+        <w:lastRenderedPageBreak/>
         <w:drawing>
-          <wp:inline distT="0" distB="0" distL="0" distR="0" wp14:anchorId="3C9900CA" wp14:editId="6F277340">
-            <wp:extent cx="5731510" cy="1709420"/>
-            <wp:effectExtent l="0" t="0" r="2540" b="5080"/>
-            <wp:docPr id="410562137" name="Picture 1" descr="A screenshot of a computer&#10;&#10;Description automatically generated"/>
+          <wp:inline distT="0" distB="0" distL="0" distR="0" wp14:anchorId="75FCBBB2" wp14:editId="0101E5E8">
+            <wp:extent cx="5731510" cy="3223895"/>
+            <wp:effectExtent l="0" t="0" r="2540" b="0"/>
+            <wp:docPr id="112649320" name="Picture 1" descr="A screenshot of a computer&#10;&#10;Description automatically generated"/>
             <wp:cNvGraphicFramePr>
               <a:graphicFrameLocks xmlns:a="http://schemas.openxmlformats.org/drawingml/2006/main" noChangeAspect="1"/>
             </wp:cNvGraphicFramePr>
@@ -116,7 +126,7 @@
               <a:graphicData uri="http://schemas.openxmlformats.org/drawingml/2006/picture">
                 <pic:pic xmlns:pic="http://schemas.openxmlformats.org/drawingml/2006/picture">
                   <pic:nvPicPr>
-                    <pic:cNvPr id="410562137" name="Picture 1" descr="A screenshot of a computer&#10;&#10;Description automatically generated"/>
+                    <pic:cNvPr id="112649320" name="Picture 1" descr="A screenshot of a computer&#10;&#10;Description automatically generated"/>
                     <pic:cNvPicPr/>
                   </pic:nvPicPr>
                   <pic:blipFill>
@@ -128,7 +138,7 @@
                   <pic:spPr>
                     <a:xfrm>
                       <a:off x="0" y="0"/>
-                      <a:ext cx="5731510" cy="1709420"/>
+                      <a:ext cx="5731510" cy="3223895"/>
                     </a:xfrm>
                     <a:prstGeom prst="rect">
                       <a:avLst/>
@@ -158,11 +168,14 @@
         </w:tabs>
       </w:pPr>
       <w:r>
+        <w:rPr>
+          <w:noProof/>
+        </w:rPr>
         <w:drawing>
-          <wp:inline distT="0" distB="0" distL="0" distR="0" wp14:anchorId="752AE59E" wp14:editId="2472CF66">
-            <wp:extent cx="5731510" cy="1585595"/>
+          <wp:inline distT="0" distB="0" distL="0" distR="0" wp14:anchorId="3F5A698F" wp14:editId="26AABE42">
+            <wp:extent cx="5731510" cy="3223895"/>
             <wp:effectExtent l="0" t="0" r="2540" b="0"/>
-            <wp:docPr id="1693621862" name="Picture 1" descr="A screenshot of a computer&#10;&#10;Description automatically generated"/>
+            <wp:docPr id="1422855230" name="Picture 1" descr="A screenshot of a computer&#10;&#10;Description automatically generated"/>
             <wp:cNvGraphicFramePr>
               <a:graphicFrameLocks xmlns:a="http://schemas.openxmlformats.org/drawingml/2006/main" noChangeAspect="1"/>
             </wp:cNvGraphicFramePr>
@@ -170,7 +183,7 @@
               <a:graphicData uri="http://schemas.openxmlformats.org/drawingml/2006/picture">
                 <pic:pic xmlns:pic="http://schemas.openxmlformats.org/drawingml/2006/picture">
                   <pic:nvPicPr>
-                    <pic:cNvPr id="1693621862" name="Picture 1" descr="A screenshot of a computer&#10;&#10;Description automatically generated"/>
+                    <pic:cNvPr id="1422855230" name="Picture 1" descr="A screenshot of a computer&#10;&#10;Description automatically generated"/>
                     <pic:cNvPicPr/>
                   </pic:nvPicPr>
                   <pic:blipFill>
@@ -182,7 +195,7 @@
                   <pic:spPr>
                     <a:xfrm>
                       <a:off x="0" y="0"/>
-                      <a:ext cx="5731510" cy="1585595"/>
+                      <a:ext cx="5731510" cy="3223895"/>
                     </a:xfrm>
                     <a:prstGeom prst="rect">
                       <a:avLst/>
@@ -226,11 +239,15 @@
         </w:tabs>
       </w:pPr>
       <w:r>
+        <w:rPr>
+          <w:noProof/>
+        </w:rPr>
+        <w:lastRenderedPageBreak/>
         <w:drawing>
-          <wp:inline distT="0" distB="0" distL="0" distR="0" wp14:anchorId="2DDC8C8B" wp14:editId="08257C3D">
-            <wp:extent cx="5731510" cy="3018790"/>
+          <wp:inline distT="0" distB="0" distL="0" distR="0" wp14:anchorId="2912D052" wp14:editId="7BA09040">
+            <wp:extent cx="5731510" cy="3223895"/>
             <wp:effectExtent l="0" t="0" r="2540" b="0"/>
-            <wp:docPr id="1404117167" name="Picture 1" descr="A screenshot of a computer&#10;&#10;Description automatically generated"/>
+            <wp:docPr id="1690962529" name="Picture 1" descr="A screenshot of a computer&#10;&#10;Description automatically generated"/>
             <wp:cNvGraphicFramePr>
               <a:graphicFrameLocks xmlns:a="http://schemas.openxmlformats.org/drawingml/2006/main" noChangeAspect="1"/>
             </wp:cNvGraphicFramePr>
@@ -238,7 +255,7 @@
               <a:graphicData uri="http://schemas.openxmlformats.org/drawingml/2006/picture">
                 <pic:pic xmlns:pic="http://schemas.openxmlformats.org/drawingml/2006/picture">
                   <pic:nvPicPr>
-                    <pic:cNvPr id="1404117167" name="Picture 1" descr="A screenshot of a computer&#10;&#10;Description automatically generated"/>
+                    <pic:cNvPr id="1690962529" name="Picture 1" descr="A screenshot of a computer&#10;&#10;Description automatically generated"/>
                     <pic:cNvPicPr/>
                   </pic:nvPicPr>
                   <pic:blipFill>
@@ -250,7 +267,7 @@
                   <pic:spPr>
                     <a:xfrm>
                       <a:off x="0" y="0"/>
-                      <a:ext cx="5731510" cy="3018790"/>
+                      <a:ext cx="5731510" cy="3223895"/>
                     </a:xfrm>
                     <a:prstGeom prst="rect">
                       <a:avLst/>
@@ -287,11 +304,14 @@
         </w:tabs>
       </w:pPr>
       <w:r>
+        <w:rPr>
+          <w:noProof/>
+        </w:rPr>
         <w:drawing>
-          <wp:inline distT="0" distB="0" distL="0" distR="0" wp14:anchorId="3213A05E" wp14:editId="38F42BFE">
-            <wp:extent cx="5731510" cy="2623820"/>
-            <wp:effectExtent l="0" t="0" r="2540" b="5080"/>
-            <wp:docPr id="1378468088" name="Picture 1" descr="A screenshot of a computer&#10;&#10;Description automatically generated"/>
+          <wp:inline distT="0" distB="0" distL="0" distR="0" wp14:anchorId="631A7481" wp14:editId="0B3CB4B7">
+            <wp:extent cx="5731510" cy="3223895"/>
+            <wp:effectExtent l="0" t="0" r="2540" b="0"/>
+            <wp:docPr id="427026701" name="Picture 1" descr="A screenshot of a computer&#10;&#10;Description automatically generated"/>
             <wp:cNvGraphicFramePr>
               <a:graphicFrameLocks xmlns:a="http://schemas.openxmlformats.org/drawingml/2006/main" noChangeAspect="1"/>
             </wp:cNvGraphicFramePr>
@@ -299,7 +319,7 @@
               <a:graphicData uri="http://schemas.openxmlformats.org/drawingml/2006/picture">
                 <pic:pic xmlns:pic="http://schemas.openxmlformats.org/drawingml/2006/picture">
                   <pic:nvPicPr>
-                    <pic:cNvPr id="1378468088" name="Picture 1" descr="A screenshot of a computer&#10;&#10;Description automatically generated"/>
+                    <pic:cNvPr id="427026701" name="Picture 1" descr="A screenshot of a computer&#10;&#10;Description automatically generated"/>
                     <pic:cNvPicPr/>
                   </pic:nvPicPr>
                   <pic:blipFill>
@@ -311,7 +331,7 @@
                   <pic:spPr>
                     <a:xfrm>
                       <a:off x="0" y="0"/>
-                      <a:ext cx="5731510" cy="2623820"/>
+                      <a:ext cx="5731510" cy="3223895"/>
                     </a:xfrm>
                     <a:prstGeom prst="rect">
                       <a:avLst/>
@@ -1251,6 +1271,29 @@
       <w:spacing w:val="5"/>
     </w:rPr>
   </w:style>
+  <w:style w:type="character" w:styleId="Hyperlink">
+    <w:name w:val="Hyperlink"/>
+    <w:basedOn w:val="DefaultParagraphFont"/>
+    <w:uiPriority w:val="99"/>
+    <w:unhideWhenUsed/>
+    <w:rsid w:val="00FE1D28"/>
+    <w:rPr>
+      <w:color w:val="467886" w:themeColor="hyperlink"/>
+      <w:u w:val="single"/>
+    </w:rPr>
+  </w:style>
+  <w:style w:type="character" w:styleId="UnresolvedMention">
+    <w:name w:val="Unresolved Mention"/>
+    <w:basedOn w:val="DefaultParagraphFont"/>
+    <w:uiPriority w:val="99"/>
+    <w:semiHidden/>
+    <w:unhideWhenUsed/>
+    <w:rsid w:val="00FE1D28"/>
+    <w:rPr>
+      <w:color w:val="605E5C"/>
+      <w:shd w:val="clear" w:color="auto" w:fill="E1DFDD"/>
+    </w:rPr>
+  </w:style>
 </w:styles>
 </file>
 

</xml_diff>